<commit_message>
Complete data cleaning notebook; restructure notebook sequence to add dedicated EDA stage before Feature Engineering
</commit_message>
<xml_diff>
--- a/Delieverables/FinLora_Data_Understanding_and_Data_Dictionary_Report.docx
+++ b/Delieverables/FinLora_Data_Understanding_and_Data_Dictionary_Report.docx
@@ -12,7 +12,6 @@
           <w:szCs w:val="24"/>
         </w:rPr>
       </w:pPr>
-      <w:proofErr w:type="spellStart"/>
       <w:r>
         <w:rPr>
           <w:rFonts w:ascii="Times New Roman" w:hAnsi="Times New Roman" w:cs="Times New Roman"/>
@@ -20,17 +19,7 @@
           <w:sz w:val="24"/>
           <w:szCs w:val="24"/>
         </w:rPr>
-        <w:t>FinLora</w:t>
-      </w:r>
-      <w:proofErr w:type="spellEnd"/>
-      <w:r>
-        <w:rPr>
-          <w:rFonts w:ascii="Times New Roman" w:hAnsi="Times New Roman" w:cs="Times New Roman"/>
-          <w:b/>
-          <w:sz w:val="24"/>
-          <w:szCs w:val="24"/>
-        </w:rPr>
-        <w:t xml:space="preserve"> Fraud Detection Project</w:t>
+        <w:t>FINLORA FRAUD DETECTION PROJECT</w:t>
       </w:r>
     </w:p>
     <w:p>
@@ -53,7 +42,7 @@
           <w:sz w:val="24"/>
           <w:szCs w:val="24"/>
         </w:rPr>
-        <w:t>Data Understanding &amp; Data Dictionary Repor</w:t>
+        <w:t>DATA UNDERSTANDING &amp; DATA DICTIONARY REPOR</w:t>
       </w:r>
       <w:r>
         <w:rPr>
@@ -62,7 +51,7 @@
           <w:sz w:val="24"/>
           <w:szCs w:val="24"/>
         </w:rPr>
-        <w:t>t</w:t>
+        <w:t>T</w:t>
       </w:r>
     </w:p>
     <w:tbl>

</xml_diff>